<commit_message>
Better formatting for `science_of_learning.docx`
</commit_message>
<xml_diff>
--- a/CourseMaterial/04_learning_machines/04_science_of_learning/science_of_learning.docx
+++ b/CourseMaterial/04_learning_machines/04_science_of_learning/science_of_learning.docx
@@ -136,7 +136,6 @@
     </w:p>
     <w:p>
       <w:pPr>
-        <w:spacing w:before="120" w:after="100" w:afterAutospacing="1" w:line="360" w:lineRule="auto"/>
         <w:rPr>
           <w:rFonts w:ascii="Garamond" w:eastAsia="Times New Roman" w:hAnsi="Garamond" w:cs="Times New Roman"/>
           <w:kern w:val="0"/>
@@ -168,11 +167,35 @@
       </w:pPr>
       <w:r>
         <w:rPr>
+          <w:rFonts w:ascii="Garamond" w:eastAsia="Times New Roman" w:hAnsi="Garamond" w:cs="Times New Roman"/>
+          <w:kern w:val="0"/>
+          <w14:ligatures w14:val="none"/>
+        </w:rPr>
+        <w:t>How</w:t>
+      </w:r>
+      <w:r>
+        <w:rPr>
           <w:rFonts w:ascii="Garamond" w:hAnsi="Garamond"/>
           <w:sz w:val="22"/>
           <w:szCs w:val="22"/>
         </w:rPr>
-        <w:t>How does the research compare with your learning experience?</w:t>
+        <w:t xml:space="preserve"> does the research</w:t>
+      </w:r>
+      <w:r>
+        <w:rPr>
+          <w:rFonts w:ascii="Garamond" w:hAnsi="Garamond"/>
+          <w:sz w:val="22"/>
+          <w:szCs w:val="22"/>
+        </w:rPr>
+        <w:t xml:space="preserve"> discussed in this paper</w:t>
+      </w:r>
+      <w:r>
+        <w:rPr>
+          <w:rFonts w:ascii="Garamond" w:hAnsi="Garamond"/>
+          <w:sz w:val="22"/>
+          <w:szCs w:val="22"/>
+        </w:rPr>
+        <w:t xml:space="preserve"> compare with your learning experience?</w:t>
       </w:r>
     </w:p>
     <w:p>
@@ -341,17 +364,17 @@
           <w:insideV w:val="single" w:sz="6" w:space="0" w:color="auto"/>
         </w:tblBorders>
         <w:tblCellMar>
-          <w:top w:w="15" w:type="dxa"/>
-          <w:left w:w="15" w:type="dxa"/>
-          <w:bottom w:w="15" w:type="dxa"/>
-          <w:right w:w="15" w:type="dxa"/>
+          <w:top w:w="72" w:type="dxa"/>
+          <w:left w:w="72" w:type="dxa"/>
+          <w:bottom w:w="72" w:type="dxa"/>
+          <w:right w:w="72" w:type="dxa"/>
         </w:tblCellMar>
         <w:tblLook w:val="04A0" w:firstRow="1" w:lastRow="0" w:firstColumn="1" w:lastColumn="0" w:noHBand="0" w:noVBand="1"/>
       </w:tblPr>
       <w:tblGrid>
-        <w:gridCol w:w="1324"/>
-        <w:gridCol w:w="2248"/>
-        <w:gridCol w:w="5778"/>
+        <w:gridCol w:w="1255"/>
+        <w:gridCol w:w="2520"/>
+        <w:gridCol w:w="5575"/>
       </w:tblGrid>
       <w:tr>
         <w:trPr>
@@ -360,7 +383,7 @@
         </w:trPr>
         <w:tc>
           <w:tcPr>
-            <w:tcW w:w="0" w:type="auto"/>
+            <w:tcW w:w="1210" w:type="dxa"/>
             <w:vAlign w:val="center"/>
             <w:hideMark/>
           </w:tcPr>
@@ -373,6 +396,8 @@
                 <w:b/>
                 <w:bCs/>
                 <w:kern w:val="0"/>
+                <w:sz w:val="22"/>
+                <w:szCs w:val="22"/>
                 <w14:ligatures w14:val="none"/>
               </w:rPr>
             </w:pPr>
@@ -382,6 +407,8 @@
                 <w:b/>
                 <w:bCs/>
                 <w:kern w:val="0"/>
+                <w:sz w:val="22"/>
+                <w:szCs w:val="22"/>
                 <w14:ligatures w14:val="none"/>
               </w:rPr>
               <w:t>Learning strategy</w:t>
@@ -390,7 +417,7 @@
         </w:tc>
         <w:tc>
           <w:tcPr>
-            <w:tcW w:w="0" w:type="auto"/>
+            <w:tcW w:w="2490" w:type="dxa"/>
             <w:vAlign w:val="center"/>
             <w:hideMark/>
           </w:tcPr>
@@ -403,6 +430,8 @@
                 <w:b/>
                 <w:bCs/>
                 <w:kern w:val="0"/>
+                <w:sz w:val="22"/>
+                <w:szCs w:val="22"/>
                 <w14:ligatures w14:val="none"/>
               </w:rPr>
             </w:pPr>
@@ -412,6 +441,8 @@
                 <w:b/>
                 <w:bCs/>
                 <w:kern w:val="0"/>
+                <w:sz w:val="22"/>
+                <w:szCs w:val="22"/>
                 <w14:ligatures w14:val="none"/>
               </w:rPr>
               <w:t>Description</w:t>
@@ -420,7 +451,7 @@
         </w:tc>
         <w:tc>
           <w:tcPr>
-            <w:tcW w:w="0" w:type="auto"/>
+            <w:tcW w:w="5530" w:type="dxa"/>
             <w:vAlign w:val="center"/>
             <w:hideMark/>
           </w:tcPr>
@@ -433,6 +464,8 @@
                 <w:b/>
                 <w:bCs/>
                 <w:kern w:val="0"/>
+                <w:sz w:val="22"/>
+                <w:szCs w:val="22"/>
                 <w14:ligatures w14:val="none"/>
               </w:rPr>
             </w:pPr>
@@ -442,6 +475,8 @@
                 <w:b/>
                 <w:bCs/>
                 <w:kern w:val="0"/>
+                <w:sz w:val="22"/>
+                <w:szCs w:val="22"/>
                 <w14:ligatures w14:val="none"/>
               </w:rPr>
               <w:t xml:space="preserve">Application examples </w:t>
@@ -452,6 +487,8 @@
                 <w:b/>
                 <w:bCs/>
                 <w:kern w:val="0"/>
+                <w:sz w:val="22"/>
+                <w:szCs w:val="22"/>
                 <w14:ligatures w14:val="none"/>
               </w:rPr>
               <w:t>from a</w:t>
@@ -462,6 +499,8 @@
                 <w:b/>
                 <w:bCs/>
                 <w:kern w:val="0"/>
+                <w:sz w:val="22"/>
+                <w:szCs w:val="22"/>
                 <w14:ligatures w14:val="none"/>
               </w:rPr>
               <w:t xml:space="preserve"> </w:t>
@@ -472,6 +511,8 @@
                 <w:b/>
                 <w:bCs/>
                 <w:kern w:val="0"/>
+                <w:sz w:val="22"/>
+                <w:szCs w:val="22"/>
                 <w14:ligatures w14:val="none"/>
               </w:rPr>
               <w:t>P</w:t>
@@ -482,6 +523,8 @@
                 <w:b/>
                 <w:bCs/>
                 <w:kern w:val="0"/>
+                <w:sz w:val="22"/>
+                <w:szCs w:val="22"/>
                 <w14:ligatures w14:val="none"/>
               </w:rPr>
               <w:t>sychology</w:t>
@@ -492,6 +535,8 @@
                 <w:b/>
                 <w:bCs/>
                 <w:kern w:val="0"/>
+                <w:sz w:val="22"/>
+                <w:szCs w:val="22"/>
                 <w14:ligatures w14:val="none"/>
               </w:rPr>
               <w:t xml:space="preserve"> Class</w:t>
@@ -505,7 +550,7 @@
         </w:trPr>
         <w:tc>
           <w:tcPr>
-            <w:tcW w:w="0" w:type="auto"/>
+            <w:tcW w:w="1210" w:type="dxa"/>
             <w:vAlign w:val="center"/>
             <w:hideMark/>
           </w:tcPr>
@@ -516,6 +561,8 @@
               <w:rPr>
                 <w:rFonts w:ascii="Garamond" w:eastAsia="Times New Roman" w:hAnsi="Garamond" w:cs="Times New Roman"/>
                 <w:kern w:val="0"/>
+                <w:sz w:val="22"/>
+                <w:szCs w:val="22"/>
                 <w14:ligatures w14:val="none"/>
               </w:rPr>
             </w:pPr>
@@ -523,6 +570,8 @@
               <w:rPr>
                 <w:rFonts w:ascii="Garamond" w:eastAsia="Times New Roman" w:hAnsi="Garamond" w:cs="Times New Roman"/>
                 <w:kern w:val="0"/>
+                <w:sz w:val="22"/>
+                <w:szCs w:val="22"/>
                 <w14:ligatures w14:val="none"/>
               </w:rPr>
               <w:t>Spaced practice</w:t>
@@ -531,7 +580,7 @@
         </w:tc>
         <w:tc>
           <w:tcPr>
-            <w:tcW w:w="0" w:type="auto"/>
+            <w:tcW w:w="2490" w:type="dxa"/>
             <w:vAlign w:val="center"/>
             <w:hideMark/>
           </w:tcPr>
@@ -541,6 +590,8 @@
               <w:rPr>
                 <w:rFonts w:ascii="Garamond" w:eastAsia="Times New Roman" w:hAnsi="Garamond" w:cs="Times New Roman"/>
                 <w:kern w:val="0"/>
+                <w:sz w:val="22"/>
+                <w:szCs w:val="22"/>
                 <w14:ligatures w14:val="none"/>
               </w:rPr>
             </w:pPr>
@@ -548,6 +599,8 @@
               <w:rPr>
                 <w:rFonts w:ascii="Garamond" w:eastAsia="Times New Roman" w:hAnsi="Garamond" w:cs="Times New Roman"/>
                 <w:kern w:val="0"/>
+                <w:sz w:val="22"/>
+                <w:szCs w:val="22"/>
                 <w14:ligatures w14:val="none"/>
               </w:rPr>
               <w:t>Creating a study schedule that spreads study activities out over time</w:t>
@@ -556,7 +609,7 @@
         </w:tc>
         <w:tc>
           <w:tcPr>
-            <w:tcW w:w="0" w:type="auto"/>
+            <w:tcW w:w="5530" w:type="dxa"/>
             <w:vAlign w:val="center"/>
             <w:hideMark/>
           </w:tcPr>
@@ -566,6 +619,8 @@
               <w:rPr>
                 <w:rFonts w:ascii="Garamond" w:eastAsia="Times New Roman" w:hAnsi="Garamond" w:cs="Times New Roman"/>
                 <w:kern w:val="0"/>
+                <w:sz w:val="22"/>
+                <w:szCs w:val="22"/>
                 <w14:ligatures w14:val="none"/>
               </w:rPr>
             </w:pPr>
@@ -573,6 +628,8 @@
               <w:rPr>
                 <w:rFonts w:ascii="Garamond" w:eastAsia="Times New Roman" w:hAnsi="Garamond" w:cs="Times New Roman"/>
                 <w:kern w:val="0"/>
+                <w:sz w:val="22"/>
+                <w:szCs w:val="22"/>
                 <w14:ligatures w14:val="none"/>
               </w:rPr>
               <w:t>Students can block off time to study and restudy key concepts such as action potentials and the nervous systems on multiple days before an exam, rather than repeatedly studying these concepts right before the exam</w:t>
@@ -586,7 +643,7 @@
         </w:trPr>
         <w:tc>
           <w:tcPr>
-            <w:tcW w:w="0" w:type="auto"/>
+            <w:tcW w:w="1210" w:type="dxa"/>
             <w:vAlign w:val="center"/>
             <w:hideMark/>
           </w:tcPr>
@@ -597,6 +654,8 @@
               <w:rPr>
                 <w:rFonts w:ascii="Garamond" w:eastAsia="Times New Roman" w:hAnsi="Garamond" w:cs="Times New Roman"/>
                 <w:kern w:val="0"/>
+                <w:sz w:val="22"/>
+                <w:szCs w:val="22"/>
                 <w14:ligatures w14:val="none"/>
               </w:rPr>
             </w:pPr>
@@ -604,6 +663,8 @@
               <w:rPr>
                 <w:rFonts w:ascii="Garamond" w:eastAsia="Times New Roman" w:hAnsi="Garamond" w:cs="Times New Roman"/>
                 <w:kern w:val="0"/>
+                <w:sz w:val="22"/>
+                <w:szCs w:val="22"/>
                 <w14:ligatures w14:val="none"/>
               </w:rPr>
               <w:t>Interleaving</w:t>
@@ -612,7 +673,7 @@
         </w:tc>
         <w:tc>
           <w:tcPr>
-            <w:tcW w:w="0" w:type="auto"/>
+            <w:tcW w:w="2490" w:type="dxa"/>
             <w:vAlign w:val="center"/>
             <w:hideMark/>
           </w:tcPr>
@@ -622,6 +683,8 @@
               <w:rPr>
                 <w:rFonts w:ascii="Garamond" w:eastAsia="Times New Roman" w:hAnsi="Garamond" w:cs="Times New Roman"/>
                 <w:kern w:val="0"/>
+                <w:sz w:val="22"/>
+                <w:szCs w:val="22"/>
                 <w14:ligatures w14:val="none"/>
               </w:rPr>
             </w:pPr>
@@ -629,6 +692,8 @@
               <w:rPr>
                 <w:rFonts w:ascii="Garamond" w:eastAsia="Times New Roman" w:hAnsi="Garamond" w:cs="Times New Roman"/>
                 <w:kern w:val="0"/>
+                <w:sz w:val="22"/>
+                <w:szCs w:val="22"/>
                 <w14:ligatures w14:val="none"/>
               </w:rPr>
               <w:t>Switching between topics while studying</w:t>
@@ -637,7 +702,7 @@
         </w:tc>
         <w:tc>
           <w:tcPr>
-            <w:tcW w:w="0" w:type="auto"/>
+            <w:tcW w:w="5530" w:type="dxa"/>
             <w:vAlign w:val="center"/>
             <w:hideMark/>
           </w:tcPr>
@@ -647,6 +712,8 @@
               <w:rPr>
                 <w:rFonts w:ascii="Garamond" w:eastAsia="Times New Roman" w:hAnsi="Garamond" w:cs="Times New Roman"/>
                 <w:kern w:val="0"/>
+                <w:sz w:val="22"/>
+                <w:szCs w:val="22"/>
                 <w14:ligatures w14:val="none"/>
               </w:rPr>
             </w:pPr>
@@ -654,6 +721,8 @@
               <w:rPr>
                 <w:rFonts w:ascii="Garamond" w:eastAsia="Times New Roman" w:hAnsi="Garamond" w:cs="Times New Roman"/>
                 <w:kern w:val="0"/>
+                <w:sz w:val="22"/>
+                <w:szCs w:val="22"/>
                 <w14:ligatures w14:val="none"/>
               </w:rPr>
               <w:t>After studying the peripheral nervous system for a few minutes, students can switch to the sympathetic nervous system and then to the parasympathetic system; next time, students can study the three in a different order, noting what new connections they can make between them</w:t>
@@ -667,7 +736,7 @@
         </w:trPr>
         <w:tc>
           <w:tcPr>
-            <w:tcW w:w="0" w:type="auto"/>
+            <w:tcW w:w="1210" w:type="dxa"/>
             <w:vAlign w:val="center"/>
             <w:hideMark/>
           </w:tcPr>
@@ -678,6 +747,8 @@
               <w:rPr>
                 <w:rFonts w:ascii="Garamond" w:eastAsia="Times New Roman" w:hAnsi="Garamond" w:cs="Times New Roman"/>
                 <w:kern w:val="0"/>
+                <w:sz w:val="22"/>
+                <w:szCs w:val="22"/>
                 <w14:ligatures w14:val="none"/>
               </w:rPr>
             </w:pPr>
@@ -685,6 +756,8 @@
               <w:rPr>
                 <w:rFonts w:ascii="Garamond" w:eastAsia="Times New Roman" w:hAnsi="Garamond" w:cs="Times New Roman"/>
                 <w:kern w:val="0"/>
+                <w:sz w:val="22"/>
+                <w:szCs w:val="22"/>
                 <w14:ligatures w14:val="none"/>
               </w:rPr>
               <w:lastRenderedPageBreak/>
@@ -694,7 +767,7 @@
         </w:tc>
         <w:tc>
           <w:tcPr>
-            <w:tcW w:w="0" w:type="auto"/>
+            <w:tcW w:w="2490" w:type="dxa"/>
             <w:vAlign w:val="center"/>
             <w:hideMark/>
           </w:tcPr>
@@ -704,6 +777,8 @@
               <w:rPr>
                 <w:rFonts w:ascii="Garamond" w:eastAsia="Times New Roman" w:hAnsi="Garamond" w:cs="Times New Roman"/>
                 <w:kern w:val="0"/>
+                <w:sz w:val="22"/>
+                <w:szCs w:val="22"/>
                 <w14:ligatures w14:val="none"/>
               </w:rPr>
             </w:pPr>
@@ -711,6 +786,8 @@
               <w:rPr>
                 <w:rFonts w:ascii="Garamond" w:eastAsia="Times New Roman" w:hAnsi="Garamond" w:cs="Times New Roman"/>
                 <w:kern w:val="0"/>
+                <w:sz w:val="22"/>
+                <w:szCs w:val="22"/>
                 <w14:ligatures w14:val="none"/>
               </w:rPr>
               <w:t>Bringing learned information to mind from long-term memory</w:t>
@@ -719,7 +796,7 @@
         </w:tc>
         <w:tc>
           <w:tcPr>
-            <w:tcW w:w="0" w:type="auto"/>
+            <w:tcW w:w="5530" w:type="dxa"/>
             <w:vAlign w:val="center"/>
             <w:hideMark/>
           </w:tcPr>
@@ -729,6 +806,8 @@
               <w:rPr>
                 <w:rFonts w:ascii="Garamond" w:eastAsia="Times New Roman" w:hAnsi="Garamond" w:cs="Times New Roman"/>
                 <w:kern w:val="0"/>
+                <w:sz w:val="22"/>
+                <w:szCs w:val="22"/>
                 <w14:ligatures w14:val="none"/>
               </w:rPr>
             </w:pPr>
@@ -736,6 +815,8 @@
               <w:rPr>
                 <w:rFonts w:ascii="Garamond" w:eastAsia="Times New Roman" w:hAnsi="Garamond" w:cs="Times New Roman"/>
                 <w:kern w:val="0"/>
+                <w:sz w:val="22"/>
+                <w:szCs w:val="22"/>
                 <w14:ligatures w14:val="none"/>
               </w:rPr>
               <w:t>When learning about neural communication, students can practice writing out how neurons work together in the brain to send messages (from dendrites, to soma, to axon, to terminal buttons)</w:t>
@@ -749,7 +830,7 @@
         </w:trPr>
         <w:tc>
           <w:tcPr>
-            <w:tcW w:w="0" w:type="auto"/>
+            <w:tcW w:w="1210" w:type="dxa"/>
             <w:vAlign w:val="center"/>
             <w:hideMark/>
           </w:tcPr>
@@ -760,6 +841,8 @@
               <w:rPr>
                 <w:rFonts w:ascii="Garamond" w:eastAsia="Times New Roman" w:hAnsi="Garamond" w:cs="Times New Roman"/>
                 <w:kern w:val="0"/>
+                <w:sz w:val="22"/>
+                <w:szCs w:val="22"/>
                 <w14:ligatures w14:val="none"/>
               </w:rPr>
             </w:pPr>
@@ -767,6 +850,8 @@
               <w:rPr>
                 <w:rFonts w:ascii="Garamond" w:eastAsia="Times New Roman" w:hAnsi="Garamond" w:cs="Times New Roman"/>
                 <w:kern w:val="0"/>
+                <w:sz w:val="22"/>
+                <w:szCs w:val="22"/>
                 <w14:ligatures w14:val="none"/>
               </w:rPr>
               <w:t>Elaboration</w:t>
@@ -775,7 +860,7 @@
         </w:tc>
         <w:tc>
           <w:tcPr>
-            <w:tcW w:w="0" w:type="auto"/>
+            <w:tcW w:w="2490" w:type="dxa"/>
             <w:vAlign w:val="center"/>
             <w:hideMark/>
           </w:tcPr>
@@ -785,6 +870,8 @@
               <w:rPr>
                 <w:rFonts w:ascii="Garamond" w:eastAsia="Times New Roman" w:hAnsi="Garamond" w:cs="Times New Roman"/>
                 <w:kern w:val="0"/>
+                <w:sz w:val="22"/>
+                <w:szCs w:val="22"/>
                 <w14:ligatures w14:val="none"/>
               </w:rPr>
             </w:pPr>
@@ -792,6 +879,8 @@
               <w:rPr>
                 <w:rFonts w:ascii="Garamond" w:eastAsia="Times New Roman" w:hAnsi="Garamond" w:cs="Times New Roman"/>
                 <w:kern w:val="0"/>
+                <w:sz w:val="22"/>
+                <w:szCs w:val="22"/>
                 <w14:ligatures w14:val="none"/>
               </w:rPr>
               <w:t>Asking and explaining why and how things work</w:t>
@@ -800,7 +889,7 @@
         </w:tc>
         <w:tc>
           <w:tcPr>
-            <w:tcW w:w="0" w:type="auto"/>
+            <w:tcW w:w="5530" w:type="dxa"/>
             <w:vAlign w:val="center"/>
             <w:hideMark/>
           </w:tcPr>
@@ -810,6 +899,8 @@
               <w:rPr>
                 <w:rFonts w:ascii="Garamond" w:eastAsia="Times New Roman" w:hAnsi="Garamond" w:cs="Times New Roman"/>
                 <w:kern w:val="0"/>
+                <w:sz w:val="22"/>
+                <w:szCs w:val="22"/>
                 <w14:ligatures w14:val="none"/>
               </w:rPr>
             </w:pPr>
@@ -817,6 +908,8 @@
               <w:rPr>
                 <w:rFonts w:ascii="Garamond" w:eastAsia="Times New Roman" w:hAnsi="Garamond" w:cs="Times New Roman"/>
                 <w:kern w:val="0"/>
+                <w:sz w:val="22"/>
+                <w:szCs w:val="22"/>
                 <w14:ligatures w14:val="none"/>
               </w:rPr>
               <w:t>Students can ask and explain why Botox prevents wrinkles: the nervous system cannot send messages to move certain muscles</w:t>
@@ -830,7 +923,7 @@
         </w:trPr>
         <w:tc>
           <w:tcPr>
-            <w:tcW w:w="0" w:type="auto"/>
+            <w:tcW w:w="1210" w:type="dxa"/>
             <w:vAlign w:val="center"/>
             <w:hideMark/>
           </w:tcPr>
@@ -841,6 +934,8 @@
               <w:rPr>
                 <w:rFonts w:ascii="Garamond" w:eastAsia="Times New Roman" w:hAnsi="Garamond" w:cs="Times New Roman"/>
                 <w:kern w:val="0"/>
+                <w:sz w:val="22"/>
+                <w:szCs w:val="22"/>
                 <w14:ligatures w14:val="none"/>
               </w:rPr>
             </w:pPr>
@@ -848,6 +943,8 @@
               <w:rPr>
                 <w:rFonts w:ascii="Garamond" w:eastAsia="Times New Roman" w:hAnsi="Garamond" w:cs="Times New Roman"/>
                 <w:kern w:val="0"/>
+                <w:sz w:val="22"/>
+                <w:szCs w:val="22"/>
                 <w14:ligatures w14:val="none"/>
               </w:rPr>
               <w:t>Concrete examples</w:t>
@@ -856,7 +953,7 @@
         </w:tc>
         <w:tc>
           <w:tcPr>
-            <w:tcW w:w="0" w:type="auto"/>
+            <w:tcW w:w="2490" w:type="dxa"/>
             <w:vAlign w:val="center"/>
             <w:hideMark/>
           </w:tcPr>
@@ -866,6 +963,8 @@
               <w:rPr>
                 <w:rFonts w:ascii="Garamond" w:eastAsia="Times New Roman" w:hAnsi="Garamond" w:cs="Times New Roman"/>
                 <w:kern w:val="0"/>
+                <w:sz w:val="22"/>
+                <w:szCs w:val="22"/>
                 <w14:ligatures w14:val="none"/>
               </w:rPr>
             </w:pPr>
@@ -873,6 +972,8 @@
               <w:rPr>
                 <w:rFonts w:ascii="Garamond" w:eastAsia="Times New Roman" w:hAnsi="Garamond" w:cs="Times New Roman"/>
                 <w:kern w:val="0"/>
+                <w:sz w:val="22"/>
+                <w:szCs w:val="22"/>
                 <w14:ligatures w14:val="none"/>
               </w:rPr>
               <w:t>When studying abstract concepts, illustrating them with specific examples</w:t>
@@ -881,7 +982,7 @@
         </w:tc>
         <w:tc>
           <w:tcPr>
-            <w:tcW w:w="0" w:type="auto"/>
+            <w:tcW w:w="5530" w:type="dxa"/>
             <w:vAlign w:val="center"/>
             <w:hideMark/>
           </w:tcPr>
@@ -891,6 +992,8 @@
               <w:rPr>
                 <w:rFonts w:ascii="Garamond" w:eastAsia="Times New Roman" w:hAnsi="Garamond" w:cs="Times New Roman"/>
                 <w:kern w:val="0"/>
+                <w:sz w:val="22"/>
+                <w:szCs w:val="22"/>
                 <w14:ligatures w14:val="none"/>
               </w:rPr>
             </w:pPr>
@@ -898,6 +1001,8 @@
               <w:rPr>
                 <w:rFonts w:ascii="Garamond" w:eastAsia="Times New Roman" w:hAnsi="Garamond" w:cs="Times New Roman"/>
                 <w:kern w:val="0"/>
+                <w:sz w:val="22"/>
+                <w:szCs w:val="22"/>
                 <w14:ligatures w14:val="none"/>
               </w:rPr>
               <w:t>Students can imagine the following example to explain the peripheral nervous system: a fire alarm goes off. The sympathetic nervous system allows people to move quickly out of the building; the parasympathetic system brings stress levels back down when the fire alarm turns off</w:t>
@@ -912,7 +1017,7 @@
         </w:trPr>
         <w:tc>
           <w:tcPr>
-            <w:tcW w:w="0" w:type="auto"/>
+            <w:tcW w:w="1210" w:type="dxa"/>
             <w:vAlign w:val="center"/>
             <w:hideMark/>
           </w:tcPr>
@@ -923,6 +1028,8 @@
               <w:rPr>
                 <w:rFonts w:ascii="Garamond" w:eastAsia="Times New Roman" w:hAnsi="Garamond" w:cs="Times New Roman"/>
                 <w:kern w:val="0"/>
+                <w:sz w:val="22"/>
+                <w:szCs w:val="22"/>
                 <w14:ligatures w14:val="none"/>
               </w:rPr>
             </w:pPr>
@@ -930,6 +1037,8 @@
               <w:rPr>
                 <w:rFonts w:ascii="Garamond" w:eastAsia="Times New Roman" w:hAnsi="Garamond" w:cs="Times New Roman"/>
                 <w:kern w:val="0"/>
+                <w:sz w:val="22"/>
+                <w:szCs w:val="22"/>
                 <w14:ligatures w14:val="none"/>
               </w:rPr>
               <w:t>Dual coding</w:t>
@@ -938,7 +1047,7 @@
         </w:tc>
         <w:tc>
           <w:tcPr>
-            <w:tcW w:w="0" w:type="auto"/>
+            <w:tcW w:w="2490" w:type="dxa"/>
             <w:vAlign w:val="center"/>
             <w:hideMark/>
           </w:tcPr>
@@ -948,6 +1057,8 @@
               <w:rPr>
                 <w:rFonts w:ascii="Garamond" w:eastAsia="Times New Roman" w:hAnsi="Garamond" w:cs="Times New Roman"/>
                 <w:kern w:val="0"/>
+                <w:sz w:val="22"/>
+                <w:szCs w:val="22"/>
                 <w14:ligatures w14:val="none"/>
               </w:rPr>
             </w:pPr>
@@ -955,6 +1066,8 @@
               <w:rPr>
                 <w:rFonts w:ascii="Garamond" w:eastAsia="Times New Roman" w:hAnsi="Garamond" w:cs="Times New Roman"/>
                 <w:kern w:val="0"/>
+                <w:sz w:val="22"/>
+                <w:szCs w:val="22"/>
                 <w14:ligatures w14:val="none"/>
               </w:rPr>
               <w:t>Combining words with visuals</w:t>
@@ -963,7 +1076,7 @@
         </w:tc>
         <w:tc>
           <w:tcPr>
-            <w:tcW w:w="0" w:type="auto"/>
+            <w:tcW w:w="5530" w:type="dxa"/>
             <w:vAlign w:val="center"/>
             <w:hideMark/>
           </w:tcPr>
@@ -973,6 +1086,8 @@
               <w:rPr>
                 <w:rFonts w:ascii="Garamond" w:eastAsia="Times New Roman" w:hAnsi="Garamond" w:cs="Times New Roman"/>
                 <w:kern w:val="0"/>
+                <w:sz w:val="22"/>
+                <w:szCs w:val="22"/>
                 <w14:ligatures w14:val="none"/>
               </w:rPr>
             </w:pPr>
@@ -980,6 +1095,8 @@
               <w:rPr>
                 <w:rFonts w:ascii="Garamond" w:eastAsia="Times New Roman" w:hAnsi="Garamond" w:cs="Times New Roman"/>
                 <w:kern w:val="0"/>
+                <w:sz w:val="22"/>
+                <w:szCs w:val="22"/>
                 <w14:ligatures w14:val="none"/>
               </w:rPr>
               <w:t>Students can draw two neurons and explain how one communicates with the other via the synaptic gap</w:t>
@@ -990,7 +1107,7 @@
     </w:tbl>
     <w:p>
       <w:pPr>
-        <w:spacing w:before="120" w:after="100" w:afterAutospacing="1" w:line="360" w:lineRule="auto"/>
+        <w:spacing w:before="360" w:after="120" w:line="360" w:lineRule="auto"/>
         <w:rPr>
           <w:rFonts w:ascii="Garamond" w:hAnsi="Garamond"/>
           <w:sz w:val="32"/>
@@ -1228,7 +1345,7 @@
     </w:p>
     <w:p>
       <w:pPr>
-        <w:spacing w:before="120" w:after="100" w:afterAutospacing="1" w:line="360" w:lineRule="auto"/>
+        <w:spacing w:before="120" w:after="120" w:line="360" w:lineRule="auto"/>
         <w:rPr>
           <w:rFonts w:ascii="Garamond" w:hAnsi="Garamond"/>
           <w:sz w:val="32"/>
@@ -1547,7 +1664,7 @@
     </w:p>
     <w:p>
       <w:pPr>
-        <w:spacing w:before="120" w:after="100" w:afterAutospacing="1" w:line="360" w:lineRule="auto"/>
+        <w:spacing w:before="120" w:after="120" w:line="360" w:lineRule="auto"/>
         <w:rPr>
           <w:rFonts w:ascii="Garamond" w:hAnsi="Garamond"/>
           <w:sz w:val="32"/>
@@ -1651,7 +1768,13 @@
           <w:rFonts w:ascii="Garamond" w:hAnsi="Garamond"/>
         </w:rPr>
         <w:lastRenderedPageBreak/>
-        <w:t xml:space="preserve">consolidation of learned information, making it easier to remember later and causing improvements in memory, transfer, and inferences. Retrieval practice also produces indirect benefits of feedback to students and teachers, which in turn can lead to more effective study and teaching practices, with a focus on information that was not accurately retrieved. </w:t>
+        <w:t>consolidation of learned information, making it easier to remember later and causing improvements in memory, transfer, and inferences</w:t>
+      </w:r>
+      <w:r>
+        <w:rPr>
+          <w:rFonts w:ascii="Garamond" w:hAnsi="Garamond"/>
+        </w:rPr>
+        <w:t>.</w:t>
       </w:r>
     </w:p>
     <w:p>
@@ -1752,19 +1875,19 @@
         <w:rPr>
           <w:rFonts w:ascii="Garamond" w:hAnsi="Garamond"/>
         </w:rPr>
-        <w:t xml:space="preserve">Practicing retrieval is a powerful way to improve meaningful learning of information, and it is relatively easy to implement in the classroom. For example, requiring students to practice retrieval can be as simple as asking students to put their class materials away and try to write out everything </w:t>
+        <w:t xml:space="preserve">Practicing retrieval is a powerful way to improve meaningful learning of information, and it is relatively easy to implement in the classroom. For example, requiring students to practice retrieval can be as simple as asking students to put their class materials away and try to write out everything they know about a topic. Retrieval-based learning strategies are also flexible. Instructors can give </w:t>
       </w:r>
       <w:r>
         <w:rPr>
           <w:rFonts w:ascii="Garamond" w:hAnsi="Garamond"/>
         </w:rPr>
         <w:lastRenderedPageBreak/>
-        <w:t>they know about a topic. Retrieval-based learning strategies are also flexible. Instructors can give students practice tests (e.g., short-answer or multiple-choice), provide open-ended prompts for the students to recall information or ask their students to create concept maps from memory.</w:t>
-      </w:r>
-    </w:p>
-    <w:p>
-      <w:pPr>
-        <w:spacing w:before="120" w:after="100" w:afterAutospacing="1" w:line="360" w:lineRule="auto"/>
+        <w:t>students practice tests (e.g., short-answer or multiple-choice), provide open-ended prompts for the students to recall information or ask their students to create concept maps from memory.</w:t>
+      </w:r>
+    </w:p>
+    <w:p>
+      <w:pPr>
+        <w:spacing w:before="120" w:after="120" w:line="360" w:lineRule="auto"/>
         <w:rPr>
           <w:rFonts w:ascii="Garamond" w:hAnsi="Garamond"/>
           <w:sz w:val="32"/>
@@ -1791,21 +1914,19 @@
         <w:rPr>
           <w:rFonts w:ascii="Garamond" w:hAnsi="Garamond"/>
         </w:rPr>
-        <w:t xml:space="preserve">Elaboration involves connecting new information to preexisting knowledge. Anderson made the following claim about elaboration: “One of the most potent manipulations that can be performed in terms of </w:t>
-      </w:r>
-      <w:proofErr w:type="spellStart"/>
-      <w:r>
-        <w:rPr>
-          <w:rFonts w:ascii="Garamond" w:hAnsi="Garamond"/>
-        </w:rPr>
-        <w:t>increasinga</w:t>
-      </w:r>
-      <w:proofErr w:type="spellEnd"/>
-      <w:r>
-        <w:rPr>
-          <w:rFonts w:ascii="Garamond" w:hAnsi="Garamond"/>
-        </w:rPr>
-        <w:t xml:space="preserve"> subject’s memory for material is to have the subject elaborate on the to-be-remembered material.” Postman defined elaboration most parsimoniously as “additions to nominal input”, and Hirshman provided an elaboration on this definition (pun intended!), defining elaboration as “A conscious, intentional process that associates to-be-remembered information with other information in memory.” However, in practice, elaboration could mean many different things. The common thread in all the definitions is that elaboration involves adding features to an existing memory.</w:t>
+        <w:t>Elaboration involves connecting new information to preexisting knowledge. Anderson made the following claim about elaboration: “One of the most potent manipulations that can be performed in terms of increasing</w:t>
+      </w:r>
+      <w:r>
+        <w:rPr>
+          <w:rFonts w:ascii="Garamond" w:hAnsi="Garamond"/>
+        </w:rPr>
+        <w:t xml:space="preserve"> </w:t>
+      </w:r>
+      <w:r>
+        <w:rPr>
+          <w:rFonts w:ascii="Garamond" w:hAnsi="Garamond"/>
+        </w:rPr>
+        <w:t>a subject’s memory for material is to have the subject elaborate on the to-be-remembered material.” Postman defined elaboration most parsimoniously as “additions to nominal input”, and Hirshman provided an elaboration on this definition, defining elaboration as “A conscious, intentional process that associates to-be-remembered information with other information in memory.” However, in practice, elaboration could mean many different things. The common thread in all the definitions is that elaboration involves adding features to an existing memory.</w:t>
       </w:r>
     </w:p>
     <w:p>
@@ -1819,7 +1940,19 @@
         <w:rPr>
           <w:rFonts w:ascii="Garamond" w:hAnsi="Garamond"/>
         </w:rPr>
-        <w:t>One possible instantiation of elaboration is thinking about information on a deeper level. The levels (or “depth”) of processing framework, proposed by Craik and Lockhart, predicts that information will be remembered better if it is processed more deeply in terms of meaning, rather than shallowly in terms of form. Another mechanism by which elaboration can confer a benefit to learning is via improvement in. By this view, elaboration involves making information more integrated and organized with existing knowledge structures. By connecting and integrating the to-be-learned information with other concepts in memory, students can increase the extent to which the ideas are organized in their minds, and this increased organization presumably facilitates the reconstruction of the past at the time of retrieval.</w:t>
+        <w:t>One possible instantiation of elaboration is thinking about information on a deeper level. The levels (or “depth”) of processing framework, proposed by Craik and Lockhart, predicts that information will be remembered better if it is processed more deeply in terms of meaning, rather than shallowly in terms of form. Another mechanism by which elaboration can confer a benefit to learning is via improvement in</w:t>
+      </w:r>
+      <w:r>
+        <w:rPr>
+          <w:rFonts w:ascii="Garamond" w:hAnsi="Garamond"/>
+        </w:rPr>
+        <w:t xml:space="preserve"> organization</w:t>
+      </w:r>
+      <w:r>
+        <w:rPr>
+          <w:rFonts w:ascii="Garamond" w:hAnsi="Garamond"/>
+        </w:rPr>
+        <w:t>. By this view, elaboration involves making information more integrated and organized with existing knowledge structures. By connecting and integrating the to-be-learned information with other concepts in memory, students can increase the extent to which the ideas are organized in their minds, and this increased organization presumably facilitates the reconstruction of the past at the time of retrieval.</w:t>
       </w:r>
     </w:p>
     <w:p>
@@ -1834,7 +1967,6 @@
         <w:rPr>
           <w:rFonts w:ascii="Garamond" w:hAnsi="Garamond"/>
         </w:rPr>
-        <w:lastRenderedPageBreak/>
         <w:fldChar w:fldCharType="begin"/>
       </w:r>
       <w:r>
@@ -1855,7 +1987,7 @@
           <w:noProof/>
         </w:rPr>
         <w:drawing>
-          <wp:inline distT="0" distB="0" distL="0" distR="0" wp14:anchorId="1F29E386" wp14:editId="445CFC69">
+          <wp:inline distT="0" distB="0" distL="0" distR="0" wp14:anchorId="07E4EE5B" wp14:editId="7498D6A6">
             <wp:extent cx="2697018" cy="2028529"/>
             <wp:effectExtent l="0" t="0" r="0" b="3810"/>
             <wp:docPr id="243229868" name="Picture 4" descr="figure 4"/>
@@ -1921,30 +2053,25 @@
         <w:rPr>
           <w:rFonts w:ascii="Garamond" w:hAnsi="Garamond"/>
         </w:rPr>
-        <w:t>The figure above shows a</w:t>
-      </w:r>
-      <w:r>
-        <w:rPr>
-          <w:rFonts w:ascii="Garamond" w:hAnsi="Garamond"/>
-        </w:rPr>
-        <w:t>n</w:t>
-      </w:r>
-      <w:r>
-        <w:rPr>
-          <w:rFonts w:ascii="Garamond" w:hAnsi="Garamond"/>
-        </w:rPr>
-        <w:t xml:space="preserve"> i</w:t>
-      </w:r>
-      <w:r>
-        <w:rPr>
-          <w:rFonts w:ascii="Garamond" w:hAnsi="Garamond"/>
-        </w:rPr>
-        <w:t>llustration of “how” and “why” questions (i.e., elaborative interrogation questions) students might ask while studying the physics of flight. To help figure out how physics explains flight, students might ask themselves the following questions: “How does a plane take off?”; “Why does a plane need an engine?” and “Why is there a downwash behind the wings?”.</w:t>
-      </w:r>
-    </w:p>
-    <w:p>
-      <w:pPr>
-        <w:spacing w:before="120" w:after="100" w:afterAutospacing="1" w:line="360" w:lineRule="auto"/>
+        <w:lastRenderedPageBreak/>
+        <w:t xml:space="preserve">The figure </w:t>
+      </w:r>
+      <w:r>
+        <w:rPr>
+          <w:rFonts w:ascii="Garamond" w:hAnsi="Garamond"/>
+        </w:rPr>
+        <w:t>above</w:t>
+      </w:r>
+      <w:r>
+        <w:rPr>
+          <w:rFonts w:ascii="Garamond" w:hAnsi="Garamond"/>
+        </w:rPr>
+        <w:t xml:space="preserve"> shows an illustration of “how” and “why” questions (i.e., elaborative interrogation questions) students might ask while studying the physics of flight. To help figure out how physics explains flight, students might ask themselves the following questions: “How does a plane take off?”; “Why does a plane need an engine?” and “Why is there a downwash behind the wings?”.</w:t>
+      </w:r>
+    </w:p>
+    <w:p>
+      <w:pPr>
+        <w:spacing w:before="120" w:after="120" w:line="360" w:lineRule="auto"/>
         <w:rPr>
           <w:rFonts w:ascii="Garamond" w:eastAsia="Times New Roman" w:hAnsi="Garamond" w:cs="Times New Roman"/>
           <w:kern w:val="0"/>
@@ -2021,14 +2148,6 @@
     <w:p>
       <w:pPr>
         <w:spacing w:before="120" w:after="100" w:afterAutospacing="1" w:line="360" w:lineRule="auto"/>
-        <w:rPr>
-          <w:rFonts w:ascii="Garamond" w:hAnsi="Garamond"/>
-        </w:rPr>
-      </w:pPr>
-    </w:p>
-    <w:p>
-      <w:pPr>
-        <w:spacing w:before="120" w:after="100" w:afterAutospacing="1" w:line="360" w:lineRule="auto"/>
         <w:jc w:val="center"/>
         <w:rPr>
           <w:rFonts w:ascii="Garamond" w:hAnsi="Garamond"/>
@@ -2038,7 +2157,6 @@
         <w:rPr>
           <w:rFonts w:ascii="Garamond" w:hAnsi="Garamond"/>
         </w:rPr>
-        <w:lastRenderedPageBreak/>
         <w:fldChar w:fldCharType="begin"/>
       </w:r>
       <w:r>
@@ -2059,7 +2177,7 @@
           <w:noProof/>
         </w:rPr>
         <w:drawing>
-          <wp:inline distT="0" distB="0" distL="0" distR="0" wp14:anchorId="55C86D20" wp14:editId="1BB21E81">
+          <wp:inline distT="0" distB="0" distL="0" distR="0" wp14:anchorId="55C86D20" wp14:editId="3EE41455">
             <wp:extent cx="1403927" cy="1051445"/>
             <wp:effectExtent l="0" t="0" r="0" b="3175"/>
             <wp:docPr id="757595558" name="Picture 5" descr="A grey block on the ground&#10;&#10;Description automatically generated"/>
@@ -2142,7 +2260,7 @@
     </w:p>
     <w:p>
       <w:pPr>
-        <w:spacing w:before="120" w:after="100" w:afterAutospacing="1" w:line="360" w:lineRule="auto"/>
+        <w:spacing w:before="120" w:after="120" w:line="360" w:lineRule="auto"/>
         <w:rPr>
           <w:rFonts w:ascii="Garamond" w:hAnsi="Garamond"/>
           <w:sz w:val="32"/>
@@ -2169,7 +2287,14 @@
         <w:rPr>
           <w:rFonts w:ascii="Garamond" w:hAnsi="Garamond"/>
         </w:rPr>
-        <w:t>Both the memory literature and folk psychology support the notion of visual examples being beneficial—the adage of “a picture is worth a thousand words” (traced back to an advertising slogan from the 1920s). Indeed, it is well-understood that more information can be conveyed through a simple illustration than through several paragraphs of text. Illustrations can be particularly helpful when the described concept involves several parts or steps and is intended for individuals with low prior knowledge.</w:t>
+        <w:t xml:space="preserve">Both the memory literature and folk psychology support the notion of visual examples being beneficial—the adage of “a picture is worth a thousand words” (traced back to an advertising slogan </w:t>
+      </w:r>
+      <w:r>
+        <w:rPr>
+          <w:rFonts w:ascii="Garamond" w:hAnsi="Garamond"/>
+        </w:rPr>
+        <w:lastRenderedPageBreak/>
+        <w:t>from the 1920s). Indeed, it is well-understood that more information can be conveyed through a simple illustration than through several paragraphs of text. Illustrations can be particularly helpful when the described concept involves several parts or steps and is intended for individuals with low prior knowledge.</w:t>
       </w:r>
     </w:p>
     <w:p>
@@ -2251,14 +2376,7 @@
         <w:rPr>
           <w:rFonts w:ascii="Garamond" w:hAnsi="Garamond"/>
         </w:rPr>
-        <w:t xml:space="preserve"> found that providing visual examples decreased conceptual errors. However, McNeill et al. also found that when students were given visually rich examples, they performed more poorly than students who were not given any visual example, suggesting that the visual details can at </w:t>
-      </w:r>
-      <w:r>
-        <w:rPr>
-          <w:rFonts w:ascii="Garamond" w:hAnsi="Garamond"/>
-        </w:rPr>
-        <w:lastRenderedPageBreak/>
-        <w:t>times become a distraction and hinder performance. Thus, it is important to consider that images used in teaching are clear and not ambiguous in their meaning.</w:t>
+        <w:t xml:space="preserve"> found that providing visual examples decreased conceptual errors. However, McNeill et al. also found that when students were given visually rich examples, they performed more poorly than students who were not given any visual example, suggesting that the visual details can at times become a distraction and hinder performance. Thus, it is important to consider that images used in teaching are clear and not ambiguous in their meaning.</w:t>
       </w:r>
     </w:p>
     <w:p>
@@ -2274,16 +2392,6 @@
         </w:rPr>
         <w:t>Critically, dual coding theory is distinct from the notion of “learning styles,” which describe the idea that individuals benefit from instruction that matches their modality preference. While this idea is pervasive and individuals often subjectively feel that they have a preference, evidence indicates that the learning styles theory is not supported by empirical findings. That is, there is no evidence that instructing students in their preferred learning style leads to an overall improvement in learning (the “meshing” hypothesis). Moreover, learning styles have come to be described as a myth or urban legend within psychology.</w:t>
       </w:r>
-    </w:p>
-    <w:p>
-      <w:pPr>
-        <w:spacing w:before="120" w:after="100" w:afterAutospacing="1" w:line="360" w:lineRule="auto"/>
-        <w:rPr>
-          <w:rFonts w:ascii="Garamond" w:hAnsi="Garamond"/>
-          <w:sz w:val="22"/>
-          <w:szCs w:val="22"/>
-        </w:rPr>
-      </w:pPr>
     </w:p>
     <w:sectPr>
       <w:pgSz w:w="12240" w:h="15840"/>
@@ -2298,6 +2406,95 @@
 <file path=word/numbering.xml><?xml version="1.0" encoding="utf-8"?>
 <w:numbering xmlns:wpc="http://schemas.microsoft.com/office/word/2010/wordprocessingCanvas" xmlns:cx="http://schemas.microsoft.com/office/drawing/2014/chartex" xmlns:cx1="http://schemas.microsoft.com/office/drawing/2015/9/8/chartex" xmlns:cx2="http://schemas.microsoft.com/office/drawing/2015/10/21/chartex" xmlns:cx3="http://schemas.microsoft.com/office/drawing/2016/5/9/chartex" xmlns:cx4="http://schemas.microsoft.com/office/drawing/2016/5/10/chartex" xmlns:cx5="http://schemas.microsoft.com/office/drawing/2016/5/11/chartex" xmlns:cx6="http://schemas.microsoft.com/office/drawing/2016/5/12/chartex" xmlns:cx7="http://schemas.microsoft.com/office/drawing/2016/5/13/chartex" xmlns:cx8="http://schemas.microsoft.com/office/drawing/2016/5/14/chartex" xmlns:mc="http://schemas.openxmlformats.org/markup-compatibility/2006" xmlns:aink="http://schemas.microsoft.com/office/drawing/2016/ink" xmlns:am3d="http://schemas.microsoft.com/office/drawing/2017/model3d" xmlns:o="urn:schemas-microsoft-com:office:office" xmlns:oel="http://schemas.microsoft.com/office/2019/extlst" xmlns:r="http://schemas.openxmlformats.org/officeDocument/2006/relationships" xmlns:m="http://schemas.openxmlformats.org/officeDocument/2006/math" xmlns:v="urn:schemas-microsoft-com:vml" xmlns:wp14="http://schemas.microsoft.com/office/word/2010/wordprocessingDrawing" xmlns:wp="http://schemas.openxmlformats.org/drawingml/2006/wordprocessingDrawing" xmlns:w10="urn:schemas-microsoft-com:office:word" xmlns:w="http://schemas.openxmlformats.org/wordprocessingml/2006/main" xmlns:w14="http://schemas.microsoft.com/office/word/2010/wordml" xmlns:w15="http://schemas.microsoft.com/office/word/2012/wordml" xmlns:w16cex="http://schemas.microsoft.com/office/word/2018/wordml/cex" xmlns:w16cid="http://schemas.microsoft.com/office/word/2016/wordml/cid" xmlns:w16="http://schemas.microsoft.com/office/word/2018/wordml" xmlns:w16du="http://schemas.microsoft.com/office/word/2023/wordml/word16du" xmlns:w16sdtdh="http://schemas.microsoft.com/office/word/2020/wordml/sdtdatahash" xmlns:w16se="http://schemas.microsoft.com/office/word/2015/wordml/symex" xmlns:wpg="http://schemas.microsoft.com/office/word/2010/wordprocessingGroup" xmlns:wpi="http://schemas.microsoft.com/office/word/2010/wordprocessingInk" xmlns:wne="http://schemas.microsoft.com/office/word/2006/wordml" xmlns:wps="http://schemas.microsoft.com/office/word/2010/wordprocessingShape" mc:Ignorable="w14 w15 w16se w16cid w16 w16cex w16sdtdh w16du wp14">
   <w:abstractNum w:abstractNumId="0" w15:restartNumberingAfterBreak="0">
+    <w:nsid w:val="392C0987"/>
+    <w:multiLevelType w:val="hybridMultilevel"/>
+    <w:tmpl w:val="2B4EC988"/>
+    <w:lvl w:ilvl="0" w:tplc="0409000F">
+      <w:start w:val="1"/>
+      <w:numFmt w:val="decimal"/>
+      <w:lvlText w:val="%1."/>
+      <w:lvlJc w:val="left"/>
+      <w:pPr>
+        <w:ind w:left="720" w:hanging="360"/>
+      </w:pPr>
+      <w:rPr>
+        <w:rFonts w:hint="default"/>
+      </w:rPr>
+    </w:lvl>
+    <w:lvl w:ilvl="1" w:tplc="04090019" w:tentative="1">
+      <w:start w:val="1"/>
+      <w:numFmt w:val="lowerLetter"/>
+      <w:lvlText w:val="%2."/>
+      <w:lvlJc w:val="left"/>
+      <w:pPr>
+        <w:ind w:left="1440" w:hanging="360"/>
+      </w:pPr>
+    </w:lvl>
+    <w:lvl w:ilvl="2" w:tplc="0409001B" w:tentative="1">
+      <w:start w:val="1"/>
+      <w:numFmt w:val="lowerRoman"/>
+      <w:lvlText w:val="%3."/>
+      <w:lvlJc w:val="right"/>
+      <w:pPr>
+        <w:ind w:left="2160" w:hanging="180"/>
+      </w:pPr>
+    </w:lvl>
+    <w:lvl w:ilvl="3" w:tplc="0409000F" w:tentative="1">
+      <w:start w:val="1"/>
+      <w:numFmt w:val="decimal"/>
+      <w:lvlText w:val="%4."/>
+      <w:lvlJc w:val="left"/>
+      <w:pPr>
+        <w:ind w:left="2880" w:hanging="360"/>
+      </w:pPr>
+    </w:lvl>
+    <w:lvl w:ilvl="4" w:tplc="04090019" w:tentative="1">
+      <w:start w:val="1"/>
+      <w:numFmt w:val="lowerLetter"/>
+      <w:lvlText w:val="%5."/>
+      <w:lvlJc w:val="left"/>
+      <w:pPr>
+        <w:ind w:left="3600" w:hanging="360"/>
+      </w:pPr>
+    </w:lvl>
+    <w:lvl w:ilvl="5" w:tplc="0409001B" w:tentative="1">
+      <w:start w:val="1"/>
+      <w:numFmt w:val="lowerRoman"/>
+      <w:lvlText w:val="%6."/>
+      <w:lvlJc w:val="right"/>
+      <w:pPr>
+        <w:ind w:left="4320" w:hanging="180"/>
+      </w:pPr>
+    </w:lvl>
+    <w:lvl w:ilvl="6" w:tplc="0409000F" w:tentative="1">
+      <w:start w:val="1"/>
+      <w:numFmt w:val="decimal"/>
+      <w:lvlText w:val="%7."/>
+      <w:lvlJc w:val="left"/>
+      <w:pPr>
+        <w:ind w:left="5040" w:hanging="360"/>
+      </w:pPr>
+    </w:lvl>
+    <w:lvl w:ilvl="7" w:tplc="04090019" w:tentative="1">
+      <w:start w:val="1"/>
+      <w:numFmt w:val="lowerLetter"/>
+      <w:lvlText w:val="%8."/>
+      <w:lvlJc w:val="left"/>
+      <w:pPr>
+        <w:ind w:left="5760" w:hanging="360"/>
+      </w:pPr>
+    </w:lvl>
+    <w:lvl w:ilvl="8" w:tplc="0409001B" w:tentative="1">
+      <w:start w:val="1"/>
+      <w:numFmt w:val="lowerRoman"/>
+      <w:lvlText w:val="%9."/>
+      <w:lvlJc w:val="right"/>
+      <w:pPr>
+        <w:ind w:left="6480" w:hanging="180"/>
+      </w:pPr>
+    </w:lvl>
+  </w:abstractNum>
+  <w:abstractNum w:abstractNumId="1" w15:restartNumberingAfterBreak="0">
     <w:nsid w:val="75870676"/>
     <w:multiLevelType w:val="hybridMultilevel"/>
     <w:tmpl w:val="D8863DD6"/>
@@ -2388,6 +2585,9 @@
     </w:lvl>
   </w:abstractNum>
   <w:num w:numId="1" w16cid:durableId="1830056051">
+    <w:abstractNumId w:val="1"/>
+  </w:num>
+  <w:num w:numId="2" w16cid:durableId="1743402668">
     <w:abstractNumId w:val="0"/>
   </w:num>
 </w:numbering>
@@ -2811,6 +3011,29 @@
       <w14:ligatures w14:val="none"/>
     </w:rPr>
   </w:style>
+  <w:style w:type="paragraph" w:styleId="Heading4">
+    <w:name w:val="heading 4"/>
+    <w:basedOn w:val="Normal"/>
+    <w:next w:val="Normal"/>
+    <w:link w:val="Heading4Char"/>
+    <w:uiPriority w:val="9"/>
+    <w:semiHidden/>
+    <w:unhideWhenUsed/>
+    <w:qFormat/>
+    <w:rsid w:val="002372C6"/>
+    <w:pPr>
+      <w:keepNext/>
+      <w:keepLines/>
+      <w:spacing w:before="40"/>
+      <w:outlineLvl w:val="3"/>
+    </w:pPr>
+    <w:rPr>
+      <w:rFonts w:asciiTheme="majorHAnsi" w:eastAsiaTheme="majorEastAsia" w:hAnsiTheme="majorHAnsi" w:cstheme="majorBidi"/>
+      <w:i/>
+      <w:iCs/>
+      <w:color w:val="2F5496" w:themeColor="accent1" w:themeShade="BF"/>
+    </w:rPr>
+  </w:style>
   <w:style w:type="character" w:default="1" w:styleId="DefaultParagraphFont">
     <w:name w:val="Default Paragraph Font"/>
     <w:uiPriority w:val="1"/>
@@ -2891,6 +3114,20 @@
       <w:ind w:left="720"/>
       <w:contextualSpacing/>
     </w:pPr>
+  </w:style>
+  <w:style w:type="character" w:customStyle="1" w:styleId="Heading4Char">
+    <w:name w:val="Heading 4 Char"/>
+    <w:basedOn w:val="DefaultParagraphFont"/>
+    <w:link w:val="Heading4"/>
+    <w:uiPriority w:val="9"/>
+    <w:semiHidden/>
+    <w:rsid w:val="002372C6"/>
+    <w:rPr>
+      <w:rFonts w:asciiTheme="majorHAnsi" w:eastAsiaTheme="majorEastAsia" w:hAnsiTheme="majorHAnsi" w:cstheme="majorBidi"/>
+      <w:i/>
+      <w:iCs/>
+      <w:color w:val="2F5496" w:themeColor="accent1" w:themeShade="BF"/>
+    </w:rPr>
   </w:style>
 </w:styles>
 </file>

</xml_diff>